<commit_message>
whole ui changes and changes in leaving employee documents format
</commit_message>
<xml_diff>
--- a/public/templates/employee-exit/no-due-certificate.docx
+++ b/public/templates/employee-exit/no-due-certificate.docx
@@ -152,7 +152,7 @@
       </w:tblGrid>
       <w:tr>
         <w:trPr>
-          <w:trHeight w:val="463"/>
+          <w:trHeight w:val="463" w:hRule="atLeast"/>
           <w:jc w:val="center"/>
         </w:trPr>
         <w:tc>
@@ -295,7 +295,7 @@
       </w:tr>
       <w:tr>
         <w:trPr>
-          <w:trHeight w:val="666"/>
+          <w:trHeight w:val="666" w:hRule="atLeast"/>
           <w:jc w:val="center"/>
         </w:trPr>
         <w:tc>
@@ -351,7 +351,7 @@
       </w:tr>
       <w:tr>
         <w:trPr>
-          <w:trHeight w:val="694"/>
+          <w:trHeight w:val="694" w:hRule="atLeast"/>
           <w:jc w:val="center"/>
         </w:trPr>
         <w:tc>
@@ -422,7 +422,7 @@
       </w:tr>
       <w:tr>
         <w:trPr>
-          <w:trHeight w:val="691"/>
+          <w:trHeight w:val="691" w:hRule="atLeast"/>
           <w:jc w:val="center"/>
         </w:trPr>
         <w:tc>
@@ -509,7 +509,7 @@
       </w:tr>
       <w:tr>
         <w:trPr>
-          <w:trHeight w:val="611"/>
+          <w:trHeight w:val="611" w:hRule="atLeast"/>
           <w:jc w:val="center"/>
         </w:trPr>
         <w:tc>

</xml_diff>